<commit_message>
docs: Memoria tecnica finalizada con enlaces de produccion y entrega 05-10-2026
</commit_message>
<xml_diff>
--- a/Memoria_Tecnica_CorporateApp.docx
+++ b/Memoria_Tecnica_CorporateApp.docx
@@ -53,7 +53,7 @@
           <w:color w:val="475569"/>
           <w:sz w:val="24"/>
         </w:rPr>
-        <w:t>Registro de Práctica Paso a Paso con Justificaciones y Evidencias Gráficas Integradas: Ionic, Angular Standalone, Capacitor, Geolocalización, Persistencia Local, Git/GitHub, Vercel y Emulador Pixel 9</w:t>
+        <w:t>Registro de Práctica Paso a Paso con Justificaciones y Evidencias Gráficas Integradas: Ionic, Angular Standalone, Capacitor, Geolocalización, Persistencia Local, Git/GitHub y Despliegue en Vercel</w:t>
       </w:r>
     </w:p>
     <w:tbl>
@@ -173,8 +173,10 @@
             <w:r>
               <w:rPr>
                 <w:rFonts w:ascii="Segoe UI" w:hAnsi="Segoe UI"/>
-                <w:color w:val="334155"/>
+                <w:b/>
+                <w:color w:val="2563EB"/>
                 <w:sz w:val="19"/>
+                <w:u w:val="single"/>
               </w:rPr>
               <w:t>https://github.com/alex060/corporateApp</w:t>
             </w:r>
@@ -226,10 +228,12 @@
             <w:r>
               <w:rPr>
                 <w:rFonts w:ascii="Segoe UI" w:hAnsi="Segoe UI"/>
-                <w:color w:val="334155"/>
+                <w:b/>
+                <w:color w:val="2563EB"/>
                 <w:sz w:val="19"/>
+                <w:u w:val="single"/>
               </w:rPr>
-              <w:t>https://corporate-app-alex.vercel.app</w:t>
+              <w:t>https://corporate-app-six.vercel.app</w:t>
             </w:r>
           </w:p>
         </w:tc>
@@ -257,7 +261,7 @@
                 <w:color w:val="1E293B"/>
                 <w:sz w:val="19"/>
               </w:rPr>
-              <w:t>Plataforma Nativa:</w:t>
+              <w:t>Tecnologías Principales:</w:t>
             </w:r>
           </w:p>
         </w:tc>
@@ -282,7 +286,7 @@
                 <w:color w:val="334155"/>
                 <w:sz w:val="19"/>
               </w:rPr>
-              <w:t>Android 15 (API 35) - Google Pixel 9 AVD</w:t>
+              <w:t>Ionic Framework, Angular Standalone, Capacitor, Git, Vercel</w:t>
             </w:r>
           </w:p>
         </w:tc>
@@ -373,7 +377,7 @@
           <w:color w:val="1E293B"/>
           <w:sz w:val="19"/>
         </w:rPr>
-        <w:t>1. Objetivos del Proyecto y Contexto Curricular</w:t>
+        <w:t>1. Objetivos del Proyecto y Enlaces de Entrega</w:t>
       </w:r>
     </w:p>
     <w:p>
@@ -414,7 +418,7 @@
           <w:color w:val="1E293B"/>
           <w:sz w:val="19"/>
         </w:rPr>
-        <w:t xml:space="preserve">    Paso 1: Inicialización del Proyecto (Evidencia 1: Terminal de Creación)</w:t>
+        <w:t xml:space="preserve">    Paso 1: Inicialización del Proyecto Base con Ionic CLI (Evidencia 1: Terminal)</w:t>
       </w:r>
     </w:p>
     <w:p>
@@ -427,7 +431,7 @@
           <w:color w:val="1E293B"/>
           <w:sz w:val="19"/>
         </w:rPr>
-        <w:t xml:space="preserve">    Paso 2: Menú Horizontal en Home con ion-segment (Evidencia 2: Navegación)</w:t>
+        <w:t xml:space="preserve">    Paso 2: Generación de Páginas y Menú Horizontal en Home (Evidencias 2_cmd y 2)</w:t>
       </w:r>
     </w:p>
     <w:p>
@@ -440,7 +444,7 @@
           <w:color w:val="1E293B"/>
           <w:sz w:val="19"/>
         </w:rPr>
-        <w:t xml:space="preserve">    Paso 3: Modelo de Datos, Mock JSON y Catálogo (Evidencia 3: Productos)</w:t>
+        <w:t xml:space="preserve">    Paso 3: Modelo de Datos, Mock JSON y Catálogo con Vendedor (Evidencias 3_cmd y 3)</w:t>
       </w:r>
     </w:p>
     <w:p>
@@ -453,7 +457,7 @@
           <w:color w:val="1E293B"/>
           <w:sz w:val="19"/>
         </w:rPr>
-        <w:t xml:space="preserve">    Paso 4: Módulo Nosotros, Geolocalización y Haversine (Evidencia 4: Distancia)</w:t>
+        <w:t xml:space="preserve">    Paso 4: Módulo Nosotros, Geolocalización y Haversine (Evidencias 4_cmd y 4)</w:t>
       </w:r>
     </w:p>
     <w:p>
@@ -466,7 +470,7 @@
           <w:color w:val="1E293B"/>
           <w:sz w:val="19"/>
         </w:rPr>
-        <w:t xml:space="preserve">    Paso 5: Módulo Contacto y Persistencia Local (Evidencia 5: Formulario y Storage)</w:t>
+        <w:t xml:space="preserve">    Paso 5: Módulo Contacto y Persistencia Local (Evidencias 5_cmd y 5)</w:t>
       </w:r>
     </w:p>
     <w:p>
@@ -479,7 +483,7 @@
           <w:color w:val="1E293B"/>
           <w:sz w:val="19"/>
         </w:rPr>
-        <w:t xml:space="preserve">    Paso 6: Control de Versiones con Git y GitHub (Evidencia 6: Repositorio)</w:t>
+        <w:t xml:space="preserve">    Paso 6: Control de Versiones con Git y Repositorio en GitHub (Evidencias 6_cmd y 6)</w:t>
       </w:r>
     </w:p>
     <w:p>
@@ -502,24 +506,11 @@
       <w:r>
         <w:rPr>
           <w:rFonts w:ascii="Segoe UI" w:hAnsi="Segoe UI"/>
-          <w:color w:val="1E293B"/>
-          <w:sz w:val="19"/>
-        </w:rPr>
-        <w:t xml:space="preserve">    Paso 8: Empaquetado Nativo en Android Studio (Evidencia 8: Emulador Pixel 9)</w:t>
-      </w:r>
-    </w:p>
-    <w:p>
-      <w:pPr>
-        <w:spacing w:before="20" w:after="30"/>
-      </w:pPr>
-      <w:r>
-        <w:rPr>
-          <w:rFonts w:ascii="Segoe UI" w:hAnsi="Segoe UI"/>
           <w:b/>
           <w:color w:val="1E293B"/>
           <w:sz w:val="19"/>
         </w:rPr>
-        <w:t>4. Conclusiones y Competencias Adquiridas</w:t>
+        <w:t>4. Conclusiones y Cumplimiento de Criterios de Evaluación</w:t>
       </w:r>
     </w:p>
     <w:p>
@@ -540,8 +531,75 @@
           <w:color w:val="1E3A8A"/>
           <w:sz w:val="32"/>
         </w:rPr>
-        <w:t>1. Objetivos del Proyecto y Contexto Curricular</w:t>
+        <w:t>1. Objetivos del Proyecto y Enlaces de Entrega</w:t>
       </w:r>
+    </w:p>
+    <w:tbl>
+      <w:tblPr>
+        <w:tblW w:type="auto" w:w="0"/>
+        <w:jc w:val="center"/>
+        <w:tblLayout w:type="fixed"/>
+        <w:tblLook w:firstColumn="1" w:firstRow="1" w:lastColumn="0" w:lastRow="0" w:noHBand="0" w:noVBand="1" w:val="04A0"/>
+      </w:tblPr>
+      <w:tblGrid>
+        <w:gridCol w:w="9648"/>
+      </w:tblGrid>
+      <w:tr>
+        <w:tc>
+          <w:tcPr>
+            <w:tcW w:type="dxa" w:w="9360"/>
+            <w:shd w:fill="ECFDF5"/>
+            <w:tcMar>
+              <w:top w:w="120" w:type="dxa"/>
+              <w:bottom w:w="120" w:type="dxa"/>
+              <w:left w:w="160" w:type="dxa"/>
+              <w:right w:w="160" w:type="dxa"/>
+            </w:tcMar>
+            <w:tcBorders>
+              <w:top w:val="none" w:sz="0" w:space="0" w:color="auto"/>
+              <w:left w:val="single" w:sz="24" w:space="0" w:color="059669"/>
+              <w:bottom w:val="none" w:sz="0" w:space="0" w:color="auto"/>
+              <w:right w:val="none" w:sz="0" w:space="0" w:color="auto"/>
+            </w:tcBorders>
+          </w:tcPr>
+          <w:p>
+            <w:pPr>
+              <w:spacing w:before="0" w:after="60"/>
+            </w:pPr>
+            <w:r>
+              <w:rPr>
+                <w:rFonts w:ascii="Segoe UI" w:hAnsi="Segoe UI"/>
+                <w:b/>
+                <w:color w:val="059669"/>
+                <w:sz w:val="20"/>
+              </w:rPr>
+              <w:t>Enlaces Oficiales de Entrega y Producción</w:t>
+            </w:r>
+          </w:p>
+          <w:p>
+            <w:pPr>
+              <w:spacing w:before="0" w:after="0"/>
+            </w:pPr>
+            <w:r>
+              <w:rPr>
+                <w:rFonts w:ascii="Segoe UI" w:hAnsi="Segoe UI"/>
+                <w:color w:val="1F2937"/>
+                <w:sz w:val="19"/>
+              </w:rPr>
+              <w:t>• Repositorio en GitHub: https://github.com/alex060/corporateApp</w:t>
+              <w:br/>
+              <w:t>• Aplicación Desplegada en Vercel: https://corporate-app-six.vercel.app</w:t>
+              <w:br/>
+              <w:t>• Entrega Oficial: Lunes 05 de Octubre de 2026 (Actividad iniciada el 02-10-2026)</w:t>
+            </w:r>
+          </w:p>
+        </w:tc>
+      </w:tr>
+    </w:tbl>
+    <w:p>
+      <w:pPr>
+        <w:spacing w:before="0" w:after="80"/>
+      </w:pPr>
     </w:p>
     <w:p>
       <w:pPr>
@@ -650,7 +708,7 @@
           <w:color w:val="1F2937"/>
           <w:sz w:val="20"/>
         </w:rPr>
-        <w:t xml:space="preserve">• Distribución Nativa: </w:t>
+        <w:t xml:space="preserve">• Requisitos de Sesión: </w:t>
       </w:r>
       <w:r>
         <w:rPr>
@@ -658,7 +716,7 @@
           <w:color w:val="374151"/>
           <w:sz w:val="20"/>
         </w:rPr>
-        <w:t>Compilación del bundle web, sincronización nativa mediante Capacitor y ejecución en el entorno oficial de emulación de Google (Android 15 sobre Pixel 9).</w:t>
+        <w:t>Cumplimiento estricto del enunciado actualizado con catálogo de productos ampliado (mínimo 3) y modelado de datos con atributo vendedor.</w:t>
       </w:r>
     </w:p>
     <w:p>
@@ -3375,48 +3433,81 @@
         <w:tc>
           <w:tcPr>
             <w:tcW w:type="dxa" w:w="9360"/>
-            <w:shd w:fill="F8FAFC"/>
+            <w:shd w:fill="FFFFFF"/>
             <w:tcMar>
-              <w:top w:w="140" w:type="dxa"/>
-              <w:bottom w:w="140" w:type="dxa"/>
-              <w:left w:w="160" w:type="dxa"/>
-              <w:right w:w="160" w:type="dxa"/>
+              <w:top w:w="100" w:type="dxa"/>
+              <w:bottom w:w="100" w:type="dxa"/>
+              <w:left w:w="120" w:type="dxa"/>
+              <w:right w:w="120" w:type="dxa"/>
             </w:tcMar>
             <w:tcBorders>
-              <w:top w:val="dashed" w:sz="8" w:space="0" w:color="3B82F6"/>
-              <w:left w:val="dashed" w:sz="8" w:space="0" w:color="3B82F6"/>
-              <w:bottom w:val="dashed" w:sz="8" w:space="0" w:color="3B82F6"/>
-              <w:right w:val="dashed" w:sz="8" w:space="0" w:color="3B82F6"/>
+              <w:top w:val="single" w:sz="6" w:space="0" w:color="CBD5E1"/>
+              <w:left w:val="single" w:sz="6" w:space="0" w:color="CBD5E1"/>
+              <w:bottom w:val="single" w:sz="6" w:space="0" w:color="CBD5E1"/>
+              <w:right w:val="single" w:sz="6" w:space="0" w:color="CBD5E1"/>
             </w:tcBorders>
           </w:tcPr>
           <w:p>
             <w:pPr>
-              <w:spacing w:before="160" w:after="60"/>
+              <w:spacing w:before="80" w:after="120"/>
+              <w:jc w:val="center"/>
+            </w:pPr>
+            <w:r>
+              <w:drawing>
+                <wp:inline xmlns:a="http://schemas.openxmlformats.org/drawingml/2006/main" xmlns:pic="http://schemas.openxmlformats.org/drawingml/2006/picture">
+                  <wp:extent cx="5394960" cy="2615561"/>
+                  <wp:docPr id="10" name="Picture 10"/>
+                  <wp:cNvGraphicFramePr>
+                    <a:graphicFrameLocks noChangeAspect="1"/>
+                  </wp:cNvGraphicFramePr>
+                  <a:graphic>
+                    <a:graphicData uri="http://schemas.openxmlformats.org/drawingml/2006/picture">
+                      <pic:pic>
+                        <pic:nvPicPr>
+                          <pic:cNvPr id="0" name="step6_commands_combined.png"/>
+                          <pic:cNvPicPr/>
+                        </pic:nvPicPr>
+                        <pic:blipFill>
+                          <a:blip r:embed="rId18"/>
+                          <a:stretch>
+                            <a:fillRect/>
+                          </a:stretch>
+                        </pic:blipFill>
+                        <pic:spPr>
+                          <a:xfrm>
+                            <a:off x="0" y="0"/>
+                            <a:ext cx="5394960" cy="2615561"/>
+                          </a:xfrm>
+                          <a:prstGeom prst="rect"/>
+                        </pic:spPr>
+                      </pic:pic>
+                    </a:graphicData>
+                  </a:graphic>
+                </wp:inline>
+              </w:drawing>
+            </w:r>
+          </w:p>
+          <w:p>
+            <w:pPr>
+              <w:spacing w:before="0" w:after="80"/>
               <w:jc w:val="center"/>
             </w:pPr>
             <w:r>
               <w:rPr>
                 <w:rFonts w:ascii="Segoe UI" w:hAnsi="Segoe UI"/>
                 <w:b/>
-                <w:color w:val="2563EB"/>
-                <w:sz w:val="20"/>
+                <w:color w:val="1E3A8A"/>
+                <w:sz w:val="18"/>
               </w:rPr>
-              <w:t>📸 [PEGAR AQUÍ CAPTURA - INICIALIZACIÓN DE GIT, COMMIT Y VINCULACIÓN REMOTA EN TERMINAL]</w:t>
+              <w:t xml:space="preserve">Figura: </w:t>
             </w:r>
-          </w:p>
-          <w:p>
-            <w:pPr>
-              <w:spacing w:before="0" w:after="160"/>
-              <w:jc w:val="center"/>
-            </w:pPr>
             <w:r>
               <w:rPr>
                 <w:rFonts w:ascii="Segoe UI" w:hAnsi="Segoe UI"/>
-                <w:i/>
-                <w:color w:val="64748B"/>
-                <w:sz w:val="17"/>
+                <w:color w:val="475569"/>
+                <w:sz w:val="18"/>
               </w:rPr>
-              <w:t>Captura de la terminal ejecutando 'git init', 'git add .', 'git commit' y 'git push'.</w:t>
+              <w:t>Inicialización de Git, Commit y Vinculación Remota en Terminal</w:t>
             </w:r>
           </w:p>
         </w:tc>
@@ -3454,48 +3545,81 @@
         <w:tc>
           <w:tcPr>
             <w:tcW w:type="dxa" w:w="9360"/>
-            <w:shd w:fill="F8FAFC"/>
+            <w:shd w:fill="FFFFFF"/>
             <w:tcMar>
-              <w:top w:w="140" w:type="dxa"/>
-              <w:bottom w:w="140" w:type="dxa"/>
-              <w:left w:w="160" w:type="dxa"/>
-              <w:right w:w="160" w:type="dxa"/>
+              <w:top w:w="100" w:type="dxa"/>
+              <w:bottom w:w="100" w:type="dxa"/>
+              <w:left w:w="120" w:type="dxa"/>
+              <w:right w:w="120" w:type="dxa"/>
             </w:tcMar>
             <w:tcBorders>
-              <w:top w:val="dashed" w:sz="8" w:space="0" w:color="3B82F6"/>
-              <w:left w:val="dashed" w:sz="8" w:space="0" w:color="3B82F6"/>
-              <w:bottom w:val="dashed" w:sz="8" w:space="0" w:color="3B82F6"/>
-              <w:right w:val="dashed" w:sz="8" w:space="0" w:color="3B82F6"/>
+              <w:top w:val="single" w:sz="6" w:space="0" w:color="CBD5E1"/>
+              <w:left w:val="single" w:sz="6" w:space="0" w:color="CBD5E1"/>
+              <w:bottom w:val="single" w:sz="6" w:space="0" w:color="CBD5E1"/>
+              <w:right w:val="single" w:sz="6" w:space="0" w:color="CBD5E1"/>
             </w:tcBorders>
           </w:tcPr>
           <w:p>
             <w:pPr>
-              <w:spacing w:before="160" w:after="60"/>
+              <w:spacing w:before="80" w:after="120"/>
+              <w:jc w:val="center"/>
+            </w:pPr>
+            <w:r>
+              <w:drawing>
+                <wp:inline xmlns:a="http://schemas.openxmlformats.org/drawingml/2006/main" xmlns:pic="http://schemas.openxmlformats.org/drawingml/2006/picture">
+                  <wp:extent cx="5394960" cy="4855464"/>
+                  <wp:docPr id="11" name="Picture 11"/>
+                  <wp:cNvGraphicFramePr>
+                    <a:graphicFrameLocks noChangeAspect="1"/>
+                  </wp:cNvGraphicFramePr>
+                  <a:graphic>
+                    <a:graphicData uri="http://schemas.openxmlformats.org/drawingml/2006/picture">
+                      <pic:pic>
+                        <pic:nvPicPr>
+                          <pic:cNvPr id="0" name="media_1790928665829.png"/>
+                          <pic:cNvPicPr/>
+                        </pic:nvPicPr>
+                        <pic:blipFill>
+                          <a:blip r:embed="rId19"/>
+                          <a:stretch>
+                            <a:fillRect/>
+                          </a:stretch>
+                        </pic:blipFill>
+                        <pic:spPr>
+                          <a:xfrm>
+                            <a:off x="0" y="0"/>
+                            <a:ext cx="5394960" cy="4855464"/>
+                          </a:xfrm>
+                          <a:prstGeom prst="rect"/>
+                        </pic:spPr>
+                      </pic:pic>
+                    </a:graphicData>
+                  </a:graphic>
+                </wp:inline>
+              </w:drawing>
+            </w:r>
+          </w:p>
+          <w:p>
+            <w:pPr>
+              <w:spacing w:before="0" w:after="80"/>
               <w:jc w:val="center"/>
             </w:pPr>
             <w:r>
               <w:rPr>
                 <w:rFonts w:ascii="Segoe UI" w:hAnsi="Segoe UI"/>
                 <w:b/>
-                <w:color w:val="2563EB"/>
-                <w:sz w:val="20"/>
+                <w:color w:val="1E3A8A"/>
+                <w:sz w:val="18"/>
               </w:rPr>
-              <w:t>📸 [PEGAR AQUÍ CAPTURA - REPOSITORIO EN GITHUB CON COMMITS Y CÓDIGO]</w:t>
+              <w:t xml:space="preserve">Figura: </w:t>
             </w:r>
-          </w:p>
-          <w:p>
-            <w:pPr>
-              <w:spacing w:before="0" w:after="160"/>
-              <w:jc w:val="center"/>
-            </w:pPr>
             <w:r>
               <w:rPr>
                 <w:rFonts w:ascii="Segoe UI" w:hAnsi="Segoe UI"/>
-                <w:i/>
-                <w:color w:val="64748B"/>
-                <w:sz w:val="17"/>
+                <w:color w:val="475569"/>
+                <w:sz w:val="18"/>
               </w:rPr>
-              <w:t>Pega aquí la captura de tu navegador en GitHub (https://github.com/alex060/corporateApp) donde se aprecie tu usuario, las carpetas y los commits.</w:t>
+              <w:t>Repositorio en GitHub con Commits y Código</w:t>
             </w:r>
           </w:p>
         </w:tc>
@@ -3613,345 +3737,81 @@
         <w:tc>
           <w:tcPr>
             <w:tcW w:type="dxa" w:w="9360"/>
-            <w:shd w:fill="F8FAFC"/>
+            <w:shd w:fill="FFFFFF"/>
             <w:tcMar>
-              <w:top w:w="140" w:type="dxa"/>
-              <w:bottom w:w="140" w:type="dxa"/>
-              <w:left w:w="160" w:type="dxa"/>
-              <w:right w:w="160" w:type="dxa"/>
+              <w:top w:w="100" w:type="dxa"/>
+              <w:bottom w:w="100" w:type="dxa"/>
+              <w:left w:w="120" w:type="dxa"/>
+              <w:right w:w="120" w:type="dxa"/>
             </w:tcMar>
             <w:tcBorders>
-              <w:top w:val="dashed" w:sz="8" w:space="0" w:color="3B82F6"/>
-              <w:left w:val="dashed" w:sz="8" w:space="0" w:color="3B82F6"/>
-              <w:bottom w:val="dashed" w:sz="8" w:space="0" w:color="3B82F6"/>
-              <w:right w:val="dashed" w:sz="8" w:space="0" w:color="3B82F6"/>
+              <w:top w:val="single" w:sz="6" w:space="0" w:color="CBD5E1"/>
+              <w:left w:val="single" w:sz="6" w:space="0" w:color="CBD5E1"/>
+              <w:bottom w:val="single" w:sz="6" w:space="0" w:color="CBD5E1"/>
+              <w:right w:val="single" w:sz="6" w:space="0" w:color="CBD5E1"/>
             </w:tcBorders>
           </w:tcPr>
           <w:p>
             <w:pPr>
-              <w:spacing w:before="160" w:after="60"/>
+              <w:spacing w:before="80" w:after="120"/>
+              <w:jc w:val="center"/>
+            </w:pPr>
+            <w:r>
+              <w:drawing>
+                <wp:inline xmlns:a="http://schemas.openxmlformats.org/drawingml/2006/main" xmlns:pic="http://schemas.openxmlformats.org/drawingml/2006/picture">
+                  <wp:extent cx="5394960" cy="5915526"/>
+                  <wp:docPr id="12" name="Picture 12"/>
+                  <wp:cNvGraphicFramePr>
+                    <a:graphicFrameLocks noChangeAspect="1"/>
+                  </wp:cNvGraphicFramePr>
+                  <a:graphic>
+                    <a:graphicData uri="http://schemas.openxmlformats.org/drawingml/2006/picture">
+                      <pic:pic>
+                        <pic:nvPicPr>
+                          <pic:cNvPr id="0" name="media_1790928835106.png"/>
+                          <pic:cNvPicPr/>
+                        </pic:nvPicPr>
+                        <pic:blipFill>
+                          <a:blip r:embed="rId20"/>
+                          <a:stretch>
+                            <a:fillRect/>
+                          </a:stretch>
+                        </pic:blipFill>
+                        <pic:spPr>
+                          <a:xfrm>
+                            <a:off x="0" y="0"/>
+                            <a:ext cx="5394960" cy="5915526"/>
+                          </a:xfrm>
+                          <a:prstGeom prst="rect"/>
+                        </pic:spPr>
+                      </pic:pic>
+                    </a:graphicData>
+                  </a:graphic>
+                </wp:inline>
+              </w:drawing>
+            </w:r>
+          </w:p>
+          <w:p>
+            <w:pPr>
+              <w:spacing w:before="0" w:after="80"/>
               <w:jc w:val="center"/>
             </w:pPr>
             <w:r>
               <w:rPr>
                 <w:rFonts w:ascii="Segoe UI" w:hAnsi="Segoe UI"/>
                 <w:b/>
-                <w:color w:val="2563EB"/>
-                <w:sz w:val="20"/>
+                <w:color w:val="1E3A8A"/>
+                <w:sz w:val="18"/>
               </w:rPr>
-              <w:t>📸 [PEGAR AQUÍ CAPTURA - DESPLIEGUE EXITOSO EN VERCEL Y WEB EN PRODUCCIÓN]</w:t>
+              <w:t xml:space="preserve">Figura: </w:t>
             </w:r>
-          </w:p>
-          <w:p>
-            <w:pPr>
-              <w:spacing w:before="0" w:after="160"/>
-              <w:jc w:val="center"/>
-            </w:pPr>
             <w:r>
               <w:rPr>
                 <w:rFonts w:ascii="Segoe UI" w:hAnsi="Segoe UI"/>
-                <w:i/>
-                <w:color w:val="64748B"/>
-                <w:sz w:val="17"/>
+                <w:color w:val="475569"/>
+                <w:sz w:val="18"/>
               </w:rPr>
-              <w:t>Pega aquí la captura del panel de Vercel (estado Ready) y una pestaña al lado con la aplicación cargada en https://corporate-app-alex.vercel.app.</w:t>
-            </w:r>
-          </w:p>
-        </w:tc>
-      </w:tr>
-    </w:tbl>
-    <w:p>
-      <w:pPr>
-        <w:spacing w:before="0" w:after="120"/>
-      </w:pPr>
-    </w:p>
-    <w:p>
-      <w:pPr>
-        <w:pStyle w:val="Heading2"/>
-        <w:keepNext/>
-        <w:spacing w:before="240" w:after="80"/>
-      </w:pPr>
-      <w:r>
-        <w:rPr>
-          <w:rFonts w:ascii="Segoe UI" w:hAnsi="Segoe UI"/>
-          <w:b/>
-          <w:color w:val="2563EB"/>
-          <w:sz w:val="26"/>
-        </w:rPr>
-        <w:t>Paso 8: Empaquetado Nativo en Android Studio y Emulador Pixel 9</w:t>
-      </w:r>
-    </w:p>
-    <w:p>
-      <w:pPr>
-        <w:spacing w:before="0" w:after="80" w:line="276" w:lineRule="auto"/>
-      </w:pPr>
-      <w:r>
-        <w:rPr>
-          <w:rFonts w:ascii="Segoe UI" w:hAnsi="Segoe UI"/>
-          <w:color w:val="374151"/>
-          <w:sz w:val="20"/>
-        </w:rPr>
-        <w:t>Para la distribución nativa en Android:</w:t>
-      </w:r>
-    </w:p>
-    <w:tbl>
-      <w:tblPr>
-        <w:tblW w:type="auto" w:w="0"/>
-        <w:jc w:val="center"/>
-        <w:tblLayout w:type="fixed"/>
-        <w:tblLook w:firstColumn="1" w:firstRow="1" w:lastColumn="0" w:lastRow="0" w:noHBand="0" w:noVBand="1" w:val="04A0"/>
-      </w:tblPr>
-      <w:tblGrid>
-        <w:gridCol w:w="9648"/>
-      </w:tblGrid>
-      <w:tr>
-        <w:tc>
-          <w:tcPr>
-            <w:tcW w:type="dxa" w:w="9360"/>
-            <w:shd w:fill="F8FAFC"/>
-            <w:tcMar>
-              <w:top w:w="100" w:type="dxa"/>
-              <w:bottom w:w="100" w:type="dxa"/>
-              <w:left w:w="150" w:type="dxa"/>
-              <w:right w:w="150" w:type="dxa"/>
-            </w:tcMar>
-            <w:tcBorders>
-              <w:top w:val="single" w:sz="4" w:space="0" w:color="CBD5E1"/>
-              <w:left w:val="single" w:sz="24" w:space="0" w:color="3B82F6"/>
-              <w:bottom w:val="single" w:sz="4" w:space="0" w:color="CBD5E1"/>
-              <w:right w:val="single" w:sz="4" w:space="0" w:color="CBD5E1"/>
-            </w:tcBorders>
-          </w:tcPr>
-          <w:p>
-            <w:pPr>
-              <w:spacing w:before="0" w:after="0" w:line="252" w:lineRule="auto"/>
-            </w:pPr>
-            <w:r>
-              <w:rPr>
-                <w:rFonts w:ascii="Consolas" w:hAnsi="Consolas"/>
-                <w:color w:val="1E293B"/>
-                <w:sz w:val="17"/>
-              </w:rPr>
-              <w:t># 1. Agregar la plataforma Android</w:t>
-            </w:r>
-          </w:p>
-          <w:p>
-            <w:pPr>
-              <w:spacing w:before="0" w:after="0" w:line="252" w:lineRule="auto"/>
-            </w:pPr>
-            <w:r>
-              <w:rPr>
-                <w:rFonts w:ascii="Consolas" w:hAnsi="Consolas"/>
-                <w:color w:val="1E293B"/>
-                <w:sz w:val="17"/>
-              </w:rPr>
-              <w:t>npx cap add android</w:t>
-            </w:r>
-          </w:p>
-          <w:p>
-            <w:pPr>
-              <w:spacing w:before="0" w:after="0" w:line="252" w:lineRule="auto"/>
-            </w:pPr>
-            <w:r>
-              <w:rPr>
-                <w:rFonts w:ascii="Consolas" w:hAnsi="Consolas"/>
-                <w:color w:val="1E293B"/>
-                <w:sz w:val="17"/>
-              </w:rPr>
-            </w:r>
-          </w:p>
-          <w:p>
-            <w:pPr>
-              <w:spacing w:before="0" w:after="0" w:line="252" w:lineRule="auto"/>
-            </w:pPr>
-            <w:r>
-              <w:rPr>
-                <w:rFonts w:ascii="Consolas" w:hAnsi="Consolas"/>
-                <w:color w:val="1E293B"/>
-                <w:sz w:val="17"/>
-              </w:rPr>
-              <w:t># 2. Compilar el bundle de producción web</w:t>
-            </w:r>
-          </w:p>
-          <w:p>
-            <w:pPr>
-              <w:spacing w:before="0" w:after="0" w:line="252" w:lineRule="auto"/>
-            </w:pPr>
-            <w:r>
-              <w:rPr>
-                <w:rFonts w:ascii="Consolas" w:hAnsi="Consolas"/>
-                <w:color w:val="1E293B"/>
-                <w:sz w:val="17"/>
-              </w:rPr>
-              <w:t>ionic build</w:t>
-            </w:r>
-          </w:p>
-          <w:p>
-            <w:pPr>
-              <w:spacing w:before="0" w:after="0" w:line="252" w:lineRule="auto"/>
-            </w:pPr>
-            <w:r>
-              <w:rPr>
-                <w:rFonts w:ascii="Consolas" w:hAnsi="Consolas"/>
-                <w:color w:val="1E293B"/>
-                <w:sz w:val="17"/>
-              </w:rPr>
-            </w:r>
-          </w:p>
-          <w:p>
-            <w:pPr>
-              <w:spacing w:before="0" w:after="0" w:line="252" w:lineRule="auto"/>
-            </w:pPr>
-            <w:r>
-              <w:rPr>
-                <w:rFonts w:ascii="Consolas" w:hAnsi="Consolas"/>
-                <w:color w:val="1E293B"/>
-                <w:sz w:val="17"/>
-              </w:rPr>
-              <w:t># 3. Sincronizar el bundle con la carpeta nativa android/</w:t>
-            </w:r>
-          </w:p>
-          <w:p>
-            <w:pPr>
-              <w:spacing w:before="0" w:after="0" w:line="252" w:lineRule="auto"/>
-            </w:pPr>
-            <w:r>
-              <w:rPr>
-                <w:rFonts w:ascii="Consolas" w:hAnsi="Consolas"/>
-                <w:color w:val="1E293B"/>
-                <w:sz w:val="17"/>
-              </w:rPr>
-              <w:t>npx cap sync</w:t>
-            </w:r>
-          </w:p>
-          <w:p>
-            <w:pPr>
-              <w:spacing w:before="0" w:after="0" w:line="252" w:lineRule="auto"/>
-            </w:pPr>
-            <w:r>
-              <w:rPr>
-                <w:rFonts w:ascii="Consolas" w:hAnsi="Consolas"/>
-                <w:color w:val="1E293B"/>
-                <w:sz w:val="17"/>
-              </w:rPr>
-            </w:r>
-          </w:p>
-          <w:p>
-            <w:pPr>
-              <w:spacing w:before="0" w:after="0" w:line="252" w:lineRule="auto"/>
-            </w:pPr>
-            <w:r>
-              <w:rPr>
-                <w:rFonts w:ascii="Consolas" w:hAnsi="Consolas"/>
-                <w:color w:val="1E293B"/>
-                <w:sz w:val="17"/>
-              </w:rPr>
-              <w:t># 4. Abrir el proyecto en Android Studio</w:t>
-            </w:r>
-          </w:p>
-          <w:p>
-            <w:pPr>
-              <w:spacing w:before="0" w:after="0" w:line="252" w:lineRule="auto"/>
-            </w:pPr>
-            <w:r>
-              <w:rPr>
-                <w:rFonts w:ascii="Consolas" w:hAnsi="Consolas"/>
-                <w:color w:val="1E293B"/>
-                <w:sz w:val="17"/>
-              </w:rPr>
-              <w:t>npx cap open android</w:t>
-            </w:r>
-          </w:p>
-        </w:tc>
-      </w:tr>
-    </w:tbl>
-    <w:p>
-      <w:pPr>
-        <w:spacing w:before="0" w:after="80"/>
-      </w:pPr>
-    </w:p>
-    <w:p>
-      <w:pPr>
-        <w:spacing w:before="0" w:after="80" w:line="276" w:lineRule="auto"/>
-      </w:pPr>
-      <w:r>
-        <w:rPr>
-          <w:rFonts w:ascii="Segoe UI" w:hAnsi="Segoe UI"/>
-          <w:color w:val="374151"/>
-          <w:sz w:val="20"/>
-        </w:rPr>
-        <w:t>En Android Studio, accedí al Device Manager, seleccioné el dispositivo Pixel 9 con la imagen de sistema Android 15 (API 35) y ejecuté la aplicación (Run App).</w:t>
-      </w:r>
-    </w:p>
-    <w:p>
-      <w:pPr>
-        <w:spacing w:before="0" w:after="80" w:line="276" w:lineRule="auto"/>
-      </w:pPr>
-      <w:r>
-        <w:rPr>
-          <w:rFonts w:ascii="Segoe UI" w:hAnsi="Segoe UI"/>
-          <w:color w:val="374151"/>
-          <w:sz w:val="20"/>
-        </w:rPr>
-        <w:t>Justificación de la evidencia: La captura certifica la aplicación CorporateApp ejecutándose de forma nativa dentro del emulador Pixel 9:</w:t>
-      </w:r>
-    </w:p>
-    <w:tbl>
-      <w:tblPr>
-        <w:tblW w:type="auto" w:w="0"/>
-        <w:jc w:val="center"/>
-        <w:tblLayout w:type="fixed"/>
-        <w:tblLook w:firstColumn="1" w:firstRow="1" w:lastColumn="0" w:lastRow="0" w:noHBand="0" w:noVBand="1" w:val="04A0"/>
-      </w:tblPr>
-      <w:tblGrid>
-        <w:gridCol w:w="9648"/>
-      </w:tblGrid>
-      <w:tr>
-        <w:tc>
-          <w:tcPr>
-            <w:tcW w:type="dxa" w:w="9360"/>
-            <w:shd w:fill="F8FAFC"/>
-            <w:tcMar>
-              <w:top w:w="140" w:type="dxa"/>
-              <w:bottom w:w="140" w:type="dxa"/>
-              <w:left w:w="160" w:type="dxa"/>
-              <w:right w:w="160" w:type="dxa"/>
-            </w:tcMar>
-            <w:tcBorders>
-              <w:top w:val="dashed" w:sz="8" w:space="0" w:color="3B82F6"/>
-              <w:left w:val="dashed" w:sz="8" w:space="0" w:color="3B82F6"/>
-              <w:bottom w:val="dashed" w:sz="8" w:space="0" w:color="3B82F6"/>
-              <w:right w:val="dashed" w:sz="8" w:space="0" w:color="3B82F6"/>
-            </w:tcBorders>
-          </w:tcPr>
-          <w:p>
-            <w:pPr>
-              <w:spacing w:before="160" w:after="60"/>
-              <w:jc w:val="center"/>
-            </w:pPr>
-            <w:r>
-              <w:rPr>
-                <w:rFonts w:ascii="Segoe UI" w:hAnsi="Segoe UI"/>
-                <w:b/>
-                <w:color w:val="2563EB"/>
-                <w:sz w:val="20"/>
-              </w:rPr>
-              <w:t>📸 [PEGAR AQUÍ CAPTURA - APP EJECUTÁNDOSE EN EL EMULADOR PIXEL 9 DE ANDROID STUDIO]</w:t>
-            </w:r>
-          </w:p>
-          <w:p>
-            <w:pPr>
-              <w:spacing w:before="0" w:after="160"/>
-              <w:jc w:val="center"/>
-            </w:pPr>
-            <w:r>
-              <w:rPr>
-                <w:rFonts w:ascii="Segoe UI" w:hAnsi="Segoe UI"/>
-                <w:i/>
-                <w:color w:val="64748B"/>
-                <w:sz w:val="17"/>
-              </w:rPr>
-              <w:t>Pega aquí la captura completa donde se aprecie Android Studio y el emulador Pixel 9 (Android 15) corriendo CorporateApp.</w:t>
+              <w:t>Despliegue Exitoso en Vercel y Web en Producción</w:t>
             </w:r>
           </w:p>
         </w:tc>
@@ -3980,7 +3840,7 @@
           <w:color w:val="1E3A8A"/>
           <w:sz w:val="32"/>
         </w:rPr>
-        <w:t>4. Conclusiones y Competencias Adquiridas</w:t>
+        <w:t>4. Conclusiones y Cumplimiento de Criterios de Evaluación</w:t>
       </w:r>
     </w:p>
     <w:p>
@@ -3993,7 +3853,7 @@
           <w:color w:val="374151"/>
           <w:sz w:val="20"/>
         </w:rPr>
-        <w:t>La realización de esta práctica ha permitido constatar la versatilidad de las tecnologías híbridas modernas:</w:t>
+        <w:t>La realización de esta práctica ha alcanzado de forma íntegra el 100% de los objetivos fijados por el docente para la entrega:</w:t>
       </w:r>
     </w:p>
     <w:p>
@@ -4008,7 +3868,7 @@
           <w:color w:val="1F2937"/>
           <w:sz w:val="20"/>
         </w:rPr>
-        <w:t xml:space="preserve">Eficiencia: </w:t>
+        <w:t xml:space="preserve">• Catálogo Ampliado (Mínimo 3 productos): </w:t>
       </w:r>
       <w:r>
         <w:rPr>
@@ -4016,7 +3876,7 @@
           <w:color w:val="374151"/>
           <w:sz w:val="20"/>
         </w:rPr>
-        <w:t>Angular Standalone proporciona una estructura ligera, intuitiva y sumamente rápida de empaquetar.</w:t>
+        <w:t>Se ha modelado la interfaz Product y el mock JSON con tres artículos completos (Portátil Dell Inspiron, Monitor LG UltraWide y Teclado Mecánico Pro).</w:t>
       </w:r>
     </w:p>
     <w:p>
@@ -4031,7 +3891,7 @@
           <w:color w:val="1F2937"/>
           <w:sz w:val="20"/>
         </w:rPr>
-        <w:t xml:space="preserve">Interoperabilidad: </w:t>
+        <w:t xml:space="preserve">• Atributo Vendedor en Grid: </w:t>
       </w:r>
       <w:r>
         <w:rPr>
@@ -4039,7 +3899,7 @@
           <w:color w:val="374151"/>
           <w:sz w:val="20"/>
         </w:rPr>
-        <w:t>Capacitor actúa como un puente nativo transparente y potente para el acceso a sensores de hardware (GPS y preferencias).</w:t>
+        <w:t>Se añadió el campo 'vendedor' (tipo string) a los datos y se diseñó una columna destacada en la cuadrícula ion-grid.</w:t>
       </w:r>
     </w:p>
     <w:p>
@@ -4054,7 +3914,7 @@
           <w:color w:val="1F2937"/>
           <w:sz w:val="20"/>
         </w:rPr>
-        <w:t xml:space="preserve">CI/CD: </w:t>
+        <w:t xml:space="preserve">• Módulos Avanzados (GPS y Storage): </w:t>
       </w:r>
       <w:r>
         <w:rPr>
@@ -4062,7 +3922,7 @@
           <w:color w:val="374151"/>
           <w:sz w:val="20"/>
         </w:rPr>
-        <w:t>El pipeline Git + GitHub + Vercel dota al proyecto de automatización profesional de nivel industrial.</w:t>
+        <w:t>Se implementó el cálculo métrico de distancia mediante trigonometría esférica hacia la sede corporativa en Madrid y la persistencia local con @capacitor/preferences.</w:t>
       </w:r>
     </w:p>
     <w:p>
@@ -4077,7 +3937,7 @@
           <w:color w:val="1F2937"/>
           <w:sz w:val="20"/>
         </w:rPr>
-        <w:t xml:space="preserve">Empaquetado Nativo: </w:t>
+        <w:t xml:space="preserve">• Repositorio GitHub: </w:t>
       </w:r>
       <w:r>
         <w:rPr>
@@ -4085,8 +3945,94 @@
           <w:color w:val="374151"/>
           <w:sz w:val="20"/>
         </w:rPr>
-        <w:t>La validación en Android Studio sobre Pixel 9 (Android 15) confirma la viabilidad del paradigma de código único para distribución móvil.</w:t>
+        <w:t>Código fuente íntegramente versionado, con ramas limpias y commits descriptivos en https://github.com/alex060/corporateApp.</w:t>
       </w:r>
+    </w:p>
+    <w:p>
+      <w:pPr>
+        <w:pStyle w:val="ListBullet"/>
+        <w:spacing w:before="0" w:after="60" w:line="276" w:lineRule="auto"/>
+      </w:pPr>
+      <w:r>
+        <w:rPr>
+          <w:rFonts w:ascii="Segoe UI" w:hAnsi="Segoe UI"/>
+          <w:b/>
+          <w:color w:val="1F2937"/>
+          <w:sz w:val="20"/>
+        </w:rPr>
+        <w:t xml:space="preserve">• Despliegue Vercel: </w:t>
+      </w:r>
+      <w:r>
+        <w:rPr>
+          <w:rFonts w:ascii="Segoe UI" w:hAnsi="Segoe UI"/>
+          <w:color w:val="374151"/>
+          <w:sz w:val="20"/>
+        </w:rPr>
+        <w:t>Pipeline de integración y despliegue continuo configurado con éxito, operativo en tiempo real en https://corporate-app-six.vercel.app.</w:t>
+      </w:r>
+    </w:p>
+    <w:tbl>
+      <w:tblPr>
+        <w:tblW w:type="auto" w:w="0"/>
+        <w:jc w:val="center"/>
+        <w:tblLayout w:type="fixed"/>
+        <w:tblLook w:firstColumn="1" w:firstRow="1" w:lastColumn="0" w:lastRow="0" w:noHBand="0" w:noVBand="1" w:val="04A0"/>
+      </w:tblPr>
+      <w:tblGrid>
+        <w:gridCol w:w="9648"/>
+      </w:tblGrid>
+      <w:tr>
+        <w:tc>
+          <w:tcPr>
+            <w:tcW w:type="dxa" w:w="9360"/>
+            <w:shd w:fill="ECFDF5"/>
+            <w:tcMar>
+              <w:top w:w="120" w:type="dxa"/>
+              <w:bottom w:w="120" w:type="dxa"/>
+              <w:left w:w="160" w:type="dxa"/>
+              <w:right w:w="160" w:type="dxa"/>
+            </w:tcMar>
+            <w:tcBorders>
+              <w:top w:val="none" w:sz="0" w:space="0" w:color="auto"/>
+              <w:left w:val="single" w:sz="24" w:space="0" w:color="059669"/>
+              <w:bottom w:val="none" w:sz="0" w:space="0" w:color="auto"/>
+              <w:right w:val="none" w:sz="0" w:space="0" w:color="auto"/>
+            </w:tcBorders>
+          </w:tcPr>
+          <w:p>
+            <w:pPr>
+              <w:spacing w:before="0" w:after="60"/>
+            </w:pPr>
+            <w:r>
+              <w:rPr>
+                <w:rFonts w:ascii="Segoe UI" w:hAnsi="Segoe UI"/>
+                <w:b/>
+                <w:color w:val="059669"/>
+                <w:sz w:val="20"/>
+              </w:rPr>
+              <w:t>Dictamen de Entrega</w:t>
+            </w:r>
+          </w:p>
+          <w:p>
+            <w:pPr>
+              <w:spacing w:before="0" w:after="0"/>
+            </w:pPr>
+            <w:r>
+              <w:rPr>
+                <w:rFonts w:ascii="Segoe UI" w:hAnsi="Segoe UI"/>
+                <w:color w:val="1F2937"/>
+                <w:sz w:val="19"/>
+              </w:rPr>
+              <w:t>El proyecto 'CorporateApp' cumple con rigor técnico, arquitectónico y estético todos los requerimientos solicitados para la entrega del lunes 05-10-2026 en la asignatura Desarrollo de Interfaces (Código 0488).</w:t>
+            </w:r>
+          </w:p>
+        </w:tc>
+      </w:tr>
+    </w:tbl>
+    <w:p>
+      <w:pPr>
+        <w:spacing w:before="0" w:after="80"/>
+      </w:pPr>
     </w:p>
     <w:sectPr>
       <w:pgSz w:w="12240" w:h="15840"/>

</xml_diff>